<commit_message>
Ganzes Haus erfassen, Rundschreiben an Mietparteien, Absender wählbar
- Betrifft: Nachricht kann ein ganzes Haus betreffen (nachrichten.objekt_id)
- Rundschreiben an alle/ausgewählte Mietparteien eines Hauses: je Mietpartei
  eine eigene E-Mail, ohne E-Mail als Aushang/Brief
- Weitere Absender (z. B. Privat) mit eigener Signatur, Briefkopf, Fußzeile,
  Absendername und KI-Ton; Vorlagen mit v_untertitel/v_fusszeile/v_gruss_firma
- Migration 20261022090000_rundschreiben_absender.sql, Edge Functions neu deployt

Co-Authored-By: Claude Opus 5.5 <noreply@anthropic.com>
Claude-Session: https://claude.ai/code/session_01JqL1C2ropmmApKDHURmYSd
</commit_message>
<xml_diff>
--- a/vorlagen/antwort.docx
+++ b/vorlagen/antwort.docx
@@ -386,7 +386,7 @@
           <w:sz w:val="19"/>
           <w:szCs w:val="19"/>
         </w:rPr>
-        <w:t xml:space="preserve">{v_firma}</w:t>
+        <w:t xml:space="preserve">{v_gruss_firma}</w:t>
       </w:r>
     </w:p>
     <w:sectPr>
@@ -458,7 +458,7 @@
         <w:sz w:val="14"/>
         <w:szCs w:val="14"/>
       </w:rPr>
-      <w:t xml:space="preserve">{v_firma} · Inhaber: {v_inhaber} · {v_strasse} · {v_plz} {v_ort} · {v_telefon} · {v_email}</w:t>
+      <w:t xml:space="preserve">{v_fusszeile}</w:t>
     </w:r>
   </w:p>
 </w:ftr>
@@ -564,7 +564,7 @@
               <w:sz w:val="16"/>
               <w:szCs w:val="16"/>
             </w:rPr>
-            <w:t xml:space="preserve">Immobilienverwaltung</w:t>
+            <w:t xml:space="preserve">{v_untertitel}</w:t>
           </w:r>
         </w:p>
       </w:tc>

</xml_diff>

<commit_message>
Unterschrift für Briefe hinterlegen und per Häkchen einsetzen
- Einstellungen › Unterschrift: Foto/Scan hochladen, Hintergrund wird entfernt,
  Bild liegt privat im Bucket vorlagen (vermieter_profil.unterschrift)
- Brief-Vorschau mit „Unterschrift einsetzen“: vorbelegt bei Mahnung, Jobcenter
  und Vertraglichem, aus bei Aushang/Rundschreiben; nie in E-Mails
- Vorlagen mit eigener Stelle {v_unterschrift} unter dem Gruß
- Migration 20261022110000_unterschrift.sql

Co-Authored-By: Claude Opus 5.5 <noreply@anthropic.com>
Claude-Session: https://claude.ai/code/session_01JqL1C2ropmmApKDHURmYSd
</commit_message>
<xml_diff>
--- a/vorlagen/antwort.docx
+++ b/vorlagen/antwort.docx
@@ -350,7 +350,7 @@
       <w:pPr>
         <w:keepNext/>
         <w:keepLines/>
-        <w:spacing w:after="480" w:before="160"/>
+        <w:spacing w:after="120" w:before="160"/>
       </w:pPr>
       <w:r>
         <w:rPr>
@@ -359,6 +359,21 @@
           <w:szCs w:val="21"/>
         </w:rPr>
         <w:t xml:space="preserve">Mit freundlichen Grüßen</w:t>
+      </w:r>
+    </w:p>
+    <w:p>
+      <w:pPr>
+        <w:keepNext/>
+        <w:keepLines/>
+        <w:spacing w:after="120" w:before="0"/>
+      </w:pPr>
+      <w:r>
+        <w:rPr>
+          <w:rFonts w:ascii="Arial" w:cs="Arial" w:eastAsia="Arial" w:hAnsi="Arial"/>
+          <w:sz w:val="21"/>
+          <w:szCs w:val="21"/>
+        </w:rPr>
+        <w:t xml:space="preserve">{v_unterschrift}</w:t>
       </w:r>
     </w:p>
     <w:p>

</xml_diff>